<commit_message>
comment 2 and 7 done
</commit_message>
<xml_diff>
--- a/documents/Reviewer Comments.docx
+++ b/documents/Reviewer Comments.docx
@@ -428,23 +428,7 @@
           <w:bCs/>
           <w:color w:val="C00000"/>
         </w:rPr>
-        <w:t>The ensemble size selection, its justification via a systematic convergence study and the associated computational cost are reported in detail in Supplementary Information Section</w:t>
-      </w:r>
-      <w:r>
-        <w:rPr>
-          <w:b/>
-          <w:bCs/>
-          <w:color w:val="C00000"/>
-        </w:rPr>
-        <w:t xml:space="preserve"> </w:t>
-      </w:r>
-      <w:r>
-        <w:rPr>
-          <w:b/>
-          <w:bCs/>
-          <w:color w:val="C00000"/>
-        </w:rPr>
-        <w:t>B.</w:t>
+        <w:t>The ensemble size selection, its justification via a systematic convergence study and the associated computational cost are reported in detail in Supplementary Information Section B.</w:t>
       </w:r>
       <w:r>
         <w:rPr>
@@ -783,23 +767,37 @@
         </w:rPr>
         <w:t xml:space="preserve">the nominal width </w:t>
       </w:r>
-      <w:proofErr w:type="gramStart"/>
-      <w:r>
-        <w:rPr>
-          <w:b/>
-          <w:bCs/>
-          <w:color w:val="C00000"/>
-        </w:rPr>
-        <w:t>are</w:t>
-      </w:r>
-      <w:proofErr w:type="gramEnd"/>
-      <w:r>
-        <w:rPr>
-          <w:b/>
-          <w:bCs/>
-          <w:color w:val="C00000"/>
-        </w:rPr>
-        <w:t xml:space="preserve"> described in Section~2.3.2 and full results are provided in SI Section</w:t>
+      <w:r>
+        <w:rPr>
+          <w:b/>
+          <w:bCs/>
+          <w:color w:val="C00000"/>
+        </w:rPr>
+        <w:t>is</w:t>
+      </w:r>
+      <w:r>
+        <w:rPr>
+          <w:b/>
+          <w:bCs/>
+          <w:color w:val="C00000"/>
+        </w:rPr>
+        <w:t xml:space="preserve"> described in Section</w:t>
+      </w:r>
+      <w:r>
+        <w:rPr>
+          <w:b/>
+          <w:bCs/>
+          <w:color w:val="C00000"/>
+        </w:rPr>
+        <w:t xml:space="preserve"> </w:t>
+      </w:r>
+      <w:r>
+        <w:rPr>
+          <w:b/>
+          <w:bCs/>
+          <w:color w:val="C00000"/>
+        </w:rPr>
+        <w:t>2.3.2 and full results are provided in SI Section</w:t>
       </w:r>
       <w:r>
         <w:rPr>
@@ -911,15 +909,7 @@
           <w:bCs/>
           <w:color w:val="C00000"/>
         </w:rPr>
-        <w:t xml:space="preserve"> included</w:t>
-      </w:r>
-      <w:r>
-        <w:rPr>
-          <w:b/>
-          <w:bCs/>
-          <w:color w:val="C00000"/>
-        </w:rPr>
-        <w:t xml:space="preserve"> Cell Line B Feed U plus 40% under an irregular measurement schedule of alternating 48-hour and 72-hour sampling</w:t>
+        <w:t xml:space="preserve"> included Cell Line B Feed U plus 40% under an irregular measurement schedule of alternating 48-hour and 72-hour sampling intervals. Together with results in 3.3.1</w:t>
       </w:r>
       <w:r>
         <w:rPr>
@@ -935,30 +925,6 @@
           <w:bCs/>
           <w:color w:val="C00000"/>
         </w:rPr>
-        <w:t>intervals.</w:t>
-      </w:r>
-      <w:r>
-        <w:rPr>
-          <w:b/>
-          <w:bCs/>
-          <w:color w:val="C00000"/>
-        </w:rPr>
-        <w:t xml:space="preserve"> Together with results in 3.3.1</w:t>
-      </w:r>
-      <w:r>
-        <w:rPr>
-          <w:b/>
-          <w:bCs/>
-          <w:color w:val="C00000"/>
-        </w:rPr>
-        <w:t xml:space="preserve"> </w:t>
-      </w:r>
-      <w:r>
-        <w:rPr>
-          <w:b/>
-          <w:bCs/>
-          <w:color w:val="C00000"/>
-        </w:rPr>
         <w:t>‘</w:t>
       </w:r>
       <w:r>
@@ -999,15 +965,7 @@
           <w:bCs/>
           <w:color w:val="C00000"/>
         </w:rPr>
-        <w:t xml:space="preserve">, this forms </w:t>
-      </w:r>
-      <w:r>
-        <w:rPr>
-          <w:b/>
-          <w:bCs/>
-          <w:color w:val="C00000"/>
-        </w:rPr>
-        <w:t xml:space="preserve">Results Section 3.3 </w:t>
+        <w:t xml:space="preserve">, this forms Results Section 3.3 </w:t>
       </w:r>
       <w:r>
         <w:rPr>
@@ -1151,6 +1109,14 @@
         <w:lastRenderedPageBreak/>
         <w:t>approach (e.g., non-mAb products, markedly different media chemistries, altered metabolic phenotypes, strong scale-dependent mass transfer constraints).</w:t>
       </w:r>
+    </w:p>
+    <w:p>
+      <w:pPr>
+        <w:rPr>
+          <w:i/>
+          <w:iCs/>
+        </w:rPr>
+      </w:pPr>
       <w:r>
         <w:rPr>
           <w:i/>
@@ -1181,23 +1147,51 @@
           <w:bCs/>
           <w:color w:val="C00000"/>
         </w:rPr>
-        <w:t xml:space="preserve">Higher uncertainty in early culture stages </w:t>
-      </w:r>
-      <w:r>
-        <w:rPr>
-          <w:b/>
-          <w:bCs/>
-          <w:color w:val="C00000"/>
-        </w:rPr>
-        <w:t xml:space="preserve">is a deliberate design as </w:t>
-      </w:r>
-      <w:r>
-        <w:rPr>
-          <w:b/>
-          <w:bCs/>
-          <w:color w:val="C00000"/>
-        </w:rPr>
-        <w:t>described in response to Comment</w:t>
+        <w:t xml:space="preserve">Higher uncertainty in early culture stages is a deliberate design as described in response to Comment 2. Mechanistically, the target system is </w:t>
+      </w:r>
+      <w:proofErr w:type="gramStart"/>
+      <w:r>
+        <w:rPr>
+          <w:b/>
+          <w:bCs/>
+          <w:color w:val="C00000"/>
+        </w:rPr>
+        <w:t>uncharacterised</w:t>
+      </w:r>
+      <w:proofErr w:type="gramEnd"/>
+      <w:r>
+        <w:rPr>
+          <w:b/>
+          <w:bCs/>
+          <w:color w:val="C00000"/>
+        </w:rPr>
+        <w:t xml:space="preserve"> and parameter values are unknown before any measurements are assimilated at </w:t>
+      </w:r>
+      <w:proofErr w:type="gramStart"/>
+      <w:r>
+        <w:rPr>
+          <w:b/>
+          <w:bCs/>
+          <w:color w:val="C00000"/>
+        </w:rPr>
+        <w:t>early stage</w:t>
+      </w:r>
+      <w:proofErr w:type="gramEnd"/>
+      <w:r>
+        <w:rPr>
+          <w:b/>
+          <w:bCs/>
+          <w:color w:val="C00000"/>
+        </w:rPr>
+        <w:t xml:space="preserve"> culture</w:t>
+      </w:r>
+      <w:r>
+        <w:rPr>
+          <w:b/>
+          <w:bCs/>
+          <w:color w:val="C00000"/>
+        </w:rPr>
+        <w:t>.</w:t>
       </w:r>
       <w:r>
         <w:rPr>
@@ -1213,91 +1207,15 @@
           <w:bCs/>
           <w:color w:val="C00000"/>
         </w:rPr>
-        <w:t xml:space="preserve">2. </w:t>
-      </w:r>
-      <w:r>
-        <w:rPr>
-          <w:b/>
-          <w:bCs/>
-          <w:color w:val="C00000"/>
-        </w:rPr>
-        <w:t>M</w:t>
-      </w:r>
-      <w:r>
-        <w:rPr>
-          <w:b/>
-          <w:bCs/>
-          <w:color w:val="C00000"/>
-        </w:rPr>
-        <w:t xml:space="preserve">echanistically, the target system is </w:t>
-      </w:r>
-      <w:proofErr w:type="gramStart"/>
-      <w:r>
-        <w:rPr>
-          <w:b/>
-          <w:bCs/>
-          <w:color w:val="C00000"/>
-        </w:rPr>
-        <w:t>uncharacterised</w:t>
-      </w:r>
-      <w:proofErr w:type="gramEnd"/>
-      <w:r>
-        <w:rPr>
-          <w:b/>
-          <w:bCs/>
-          <w:color w:val="C00000"/>
-        </w:rPr>
-        <w:t xml:space="preserve"> and parameter values are unknown before any measurements are assimilated</w:t>
-      </w:r>
-      <w:r>
-        <w:rPr>
-          <w:b/>
-          <w:bCs/>
-          <w:color w:val="C00000"/>
-        </w:rPr>
-        <w:t xml:space="preserve"> at </w:t>
-      </w:r>
-      <w:proofErr w:type="gramStart"/>
-      <w:r>
-        <w:rPr>
-          <w:b/>
-          <w:bCs/>
-          <w:color w:val="C00000"/>
-        </w:rPr>
-        <w:t>early stage</w:t>
-      </w:r>
-      <w:proofErr w:type="gramEnd"/>
-      <w:r>
-        <w:rPr>
-          <w:b/>
-          <w:bCs/>
-          <w:color w:val="C00000"/>
-        </w:rPr>
-        <w:t xml:space="preserve"> culture</w:t>
-      </w:r>
-      <w:r>
-        <w:rPr>
-          <w:b/>
-          <w:bCs/>
-          <w:color w:val="C00000"/>
-        </w:rPr>
-        <w:t xml:space="preserve">; statistically, the ensemble has not yet been constrained by data. As measurements accumulate, the ensemble </w:t>
-      </w:r>
-      <w:r>
-        <w:rPr>
-          <w:b/>
-          <w:bCs/>
-          <w:color w:val="C00000"/>
-        </w:rPr>
-        <w:t xml:space="preserve">tightens </w:t>
-      </w:r>
-      <w:r>
-        <w:rPr>
-          <w:b/>
-          <w:bCs/>
-          <w:color w:val="C00000"/>
-        </w:rPr>
-        <w:t xml:space="preserve">and uncertainty reduces accordingly.                                                                                                                       </w:t>
+        <w:t>S</w:t>
+      </w:r>
+      <w:r>
+        <w:rPr>
+          <w:b/>
+          <w:bCs/>
+          <w:color w:val="C00000"/>
+        </w:rPr>
+        <w:t xml:space="preserve">tatistically, the ensemble has not yet been constrained by data. As measurements accumulate, the ensemble tightens and uncertainty reduces accordingly.                                                                                                                       </w:t>
       </w:r>
     </w:p>
     <w:p>

</xml_diff>

<commit_message>
added source and target comment from reviewer
</commit_message>
<xml_diff>
--- a/documents/Reviewer Comments.docx
+++ b/documents/Reviewer Comments.docx
@@ -513,6 +513,56 @@
         </w:rPr>
         <w:t xml:space="preserve">. </w:t>
       </w:r>
+      <w:r>
+        <w:rPr>
+          <w:b/>
+          <w:bCs/>
+          <w:color w:val="C00000"/>
+        </w:rPr>
+        <w:t>Reparameterization</w:t>
+      </w:r>
+      <w:r>
+        <w:rPr>
+          <w:b/>
+          <w:bCs/>
+          <w:color w:val="C00000"/>
+        </w:rPr>
+        <w:t xml:space="preserve"> refers to dataset-specific parameter fitting using target-system </w:t>
+      </w:r>
+      <w:proofErr w:type="gramStart"/>
+      <w:r>
+        <w:rPr>
+          <w:b/>
+          <w:bCs/>
+          <w:color w:val="C00000"/>
+        </w:rPr>
+        <w:t xml:space="preserve">data </w:t>
+      </w:r>
+      <w:r>
+        <w:rPr>
+          <w:b/>
+          <w:bCs/>
+          <w:color w:val="C00000"/>
+        </w:rPr>
+        <w:t>,</w:t>
+      </w:r>
+      <w:proofErr w:type="gramEnd"/>
+      <w:r>
+        <w:rPr>
+          <w:b/>
+          <w:bCs/>
+          <w:color w:val="C00000"/>
+        </w:rPr>
+        <w:t xml:space="preserve"> </w:t>
+      </w:r>
+      <w:r>
+        <w:rPr>
+          <w:b/>
+          <w:bCs/>
+          <w:color w:val="C00000"/>
+        </w:rPr>
+        <w:t xml:space="preserve">a procedure that requires the full dataset </w:t>
+      </w:r>
       <w:proofErr w:type="spellStart"/>
       <w:r>
         <w:rPr>
@@ -520,7 +570,7 @@
           <w:bCs/>
           <w:color w:val="C00000"/>
         </w:rPr>
-        <w:t>Reparametrisation</w:t>
+        <w:t>upfront</w:t>
       </w:r>
       <w:proofErr w:type="spellEnd"/>
       <w:r>
@@ -529,41 +579,23 @@
           <w:bCs/>
           <w:color w:val="C00000"/>
         </w:rPr>
-        <w:t xml:space="preserve"> refers to dataset-specific parameter fitting using target-system </w:t>
-      </w:r>
-      <w:proofErr w:type="gramStart"/>
-      <w:r>
-        <w:rPr>
-          <w:b/>
-          <w:bCs/>
-          <w:color w:val="C00000"/>
-        </w:rPr>
-        <w:t xml:space="preserve">data </w:t>
-      </w:r>
-      <w:r>
-        <w:rPr>
-          <w:b/>
-          <w:bCs/>
-          <w:color w:val="C00000"/>
-        </w:rPr>
-        <w:t>,</w:t>
-      </w:r>
-      <w:proofErr w:type="gramEnd"/>
-      <w:r>
-        <w:rPr>
-          <w:b/>
-          <w:bCs/>
-          <w:color w:val="C00000"/>
-        </w:rPr>
-        <w:t xml:space="preserve"> </w:t>
-      </w:r>
-      <w:r>
-        <w:rPr>
-          <w:b/>
-          <w:bCs/>
-          <w:color w:val="C00000"/>
-        </w:rPr>
-        <w:t xml:space="preserve">a procedure that requires the full dataset </w:t>
+        <w:t xml:space="preserve"> and produces parameters tailored to one condition. The prior means used here are taken </w:t>
+      </w:r>
+      <w:r>
+        <w:rPr>
+          <w:b/>
+          <w:bCs/>
+          <w:color w:val="C00000"/>
+        </w:rPr>
+        <w:t xml:space="preserve">directly </w:t>
+      </w:r>
+      <w:r>
+        <w:rPr>
+          <w:b/>
+          <w:bCs/>
+          <w:color w:val="C00000"/>
+        </w:rPr>
+        <w:t xml:space="preserve">from </w:t>
       </w:r>
       <w:proofErr w:type="spellStart"/>
       <w:r>
@@ -572,7 +604,7 @@
           <w:bCs/>
           <w:color w:val="C00000"/>
         </w:rPr>
-        <w:t>upfront</w:t>
+        <w:t>Kotidis</w:t>
       </w:r>
       <w:proofErr w:type="spellEnd"/>
       <w:r>
@@ -581,52 +613,16 @@
           <w:bCs/>
           <w:color w:val="C00000"/>
         </w:rPr>
-        <w:t xml:space="preserve"> and produces parameters tailored to one condition. The prior means used here are taken </w:t>
-      </w:r>
-      <w:r>
-        <w:rPr>
-          <w:b/>
-          <w:bCs/>
-          <w:color w:val="C00000"/>
-        </w:rPr>
-        <w:t xml:space="preserve">directly </w:t>
-      </w:r>
-      <w:r>
-        <w:rPr>
-          <w:b/>
-          <w:bCs/>
-          <w:color w:val="C00000"/>
-        </w:rPr>
-        <w:t xml:space="preserve">from </w:t>
-      </w:r>
-      <w:proofErr w:type="spellStart"/>
-      <w:r>
-        <w:rPr>
-          <w:b/>
-          <w:bCs/>
-          <w:color w:val="C00000"/>
-        </w:rPr>
-        <w:t>Kotidis</w:t>
-      </w:r>
-      <w:proofErr w:type="spellEnd"/>
-      <w:r>
-        <w:rPr>
-          <w:b/>
-          <w:bCs/>
-          <w:color w:val="C00000"/>
-        </w:rPr>
         <w:t xml:space="preserve"> et al. (2019) and applied identically across all six target datasets </w:t>
       </w:r>
-      <w:proofErr w:type="gramStart"/>
-      <w:r>
-        <w:rPr>
-          <w:b/>
-          <w:bCs/>
-          <w:color w:val="C00000"/>
-        </w:rPr>
-        <w:t>without  adjustment</w:t>
-      </w:r>
-      <w:proofErr w:type="gramEnd"/>
+      <w:r>
+        <w:rPr>
+          <w:b/>
+          <w:bCs/>
+          <w:color w:val="C00000"/>
+        </w:rPr>
+        <w:t>without adjustment</w:t>
+      </w:r>
       <w:r>
         <w:rPr>
           <w:b/>
@@ -733,16 +729,14 @@
         </w:rPr>
         <w:t xml:space="preserve">, deliberately set as high as possible but mechanistically </w:t>
       </w:r>
-      <w:proofErr w:type="spellStart"/>
-      <w:r>
-        <w:rPr>
-          <w:b/>
-          <w:bCs/>
-          <w:color w:val="C00000"/>
-        </w:rPr>
-        <w:t>plasusible</w:t>
-      </w:r>
-      <w:proofErr w:type="spellEnd"/>
+      <w:r>
+        <w:rPr>
+          <w:b/>
+          <w:bCs/>
+          <w:color w:val="C00000"/>
+        </w:rPr>
+        <w:t>plausible</w:t>
+      </w:r>
       <w:r>
         <w:rPr>
           <w:b/>
@@ -854,6 +848,14 @@
         </w:rPr>
         <w:t xml:space="preserve"> discuss structural versus practical identifiability (even if briefly).</w:t>
       </w:r>
+    </w:p>
+    <w:p>
+      <w:pPr>
+        <w:rPr>
+          <w:i/>
+          <w:iCs/>
+        </w:rPr>
+      </w:pPr>
     </w:p>
     <w:p>
       <w:pPr>
@@ -1070,6 +1072,8 @@
         </w:rPr>
         <w:t xml:space="preserve"> does not provide quantitative comparisons.</w:t>
       </w:r>
+    </w:p>
+    <w:p>
       <w:r>
         <w:rPr>
           <w:i/>
@@ -1099,7 +1103,7 @@
           <w:i/>
           <w:iCs/>
         </w:rPr>
-        <w:t xml:space="preserve"> clarify the CHO-GS46 cell line (recombinant product type, selection system, whether the product is comparable in complexity), and whether basal media and feeds are shared or materially different across datasets. The current validation suggests transfer across moderately related conditions; please temper claims accordingly and discuss what would likely break the </w:t>
+        <w:t xml:space="preserve"> clarify the CHO-GS46 cell line (recombinant product type, selection system, whether the product is comparable in </w:t>
       </w:r>
       <w:r>
         <w:rPr>
@@ -1107,16 +1111,196 @@
           <w:iCs/>
         </w:rPr>
         <w:lastRenderedPageBreak/>
-        <w:t>approach (e.g., non-mAb products, markedly different media chemistries, altered metabolic phenotypes, strong scale-dependent mass transfer constraints).</w:t>
-      </w:r>
-    </w:p>
-    <w:p>
-      <w:pPr>
-        <w:rPr>
-          <w:i/>
-          <w:iCs/>
-        </w:rPr>
-      </w:pPr>
+        <w:t>complexity), and whether basal media and feeds are shared or materially different across datasets. The current validation suggests transfer across moderately related conditions; please temper claims accordingly and discuss what would likely break the approach (e.g., non-mAb products, markedly different media chemistries, altered metabolic phenotypes, strong scale-dependent mass transfer constraints).</w:t>
+      </w:r>
+    </w:p>
+    <w:p>
+      <w:pPr>
+        <w:rPr>
+          <w:b/>
+          <w:bCs/>
+          <w:color w:val="C00000"/>
+        </w:rPr>
+      </w:pPr>
+      <w:r>
+        <w:rPr>
+          <w:b/>
+          <w:bCs/>
+          <w:color w:val="C00000"/>
+        </w:rPr>
+        <w:t>We thank the reviewer for this important point. We have revised the Conclusions (paragraph 4) to more clearly contextualise the biological distance</w:t>
+      </w:r>
+      <w:r>
+        <w:rPr>
+          <w:b/>
+          <w:bCs/>
+          <w:color w:val="C00000"/>
+        </w:rPr>
+        <w:t xml:space="preserve"> </w:t>
+      </w:r>
+      <w:r>
+        <w:rPr>
+          <w:b/>
+          <w:bCs/>
+          <w:color w:val="C00000"/>
+        </w:rPr>
+        <w:t>between source and target systems and to discuss the conditions under which the approach would no longer yield valid mechanistic insight.</w:t>
+      </w:r>
+    </w:p>
+    <w:p>
+      <w:pPr>
+        <w:rPr>
+          <w:b/>
+          <w:bCs/>
+          <w:color w:val="C00000"/>
+        </w:rPr>
+      </w:pPr>
+      <w:r>
+        <w:rPr>
+          <w:b/>
+          <w:bCs/>
+          <w:color w:val="C00000"/>
+        </w:rPr>
+        <w:t>Both cell lines employ glutamine synthetase selection and produce IgG monoclonal antibodies of comparable structural complexity (IgG1 and IgG4</w:t>
+      </w:r>
+      <w:r>
+        <w:rPr>
+          <w:b/>
+          <w:bCs/>
+          <w:color w:val="C00000"/>
+        </w:rPr>
+        <w:t xml:space="preserve"> </w:t>
+      </w:r>
+      <w:r>
+        <w:rPr>
+          <w:b/>
+          <w:bCs/>
+          <w:color w:val="C00000"/>
+        </w:rPr>
+        <w:t>respectively), justifying the use of a shared model structure across all datasets. The validation therefore represents transfer across moderately</w:t>
+      </w:r>
+      <w:r>
+        <w:rPr>
+          <w:b/>
+          <w:bCs/>
+          <w:color w:val="C00000"/>
+        </w:rPr>
+        <w:t xml:space="preserve"> </w:t>
+      </w:r>
+      <w:r>
+        <w:rPr>
+          <w:b/>
+          <w:bCs/>
+          <w:color w:val="C00000"/>
+        </w:rPr>
+        <w:t>related conditions, and we have tempered our claims accordingly.</w:t>
+      </w:r>
+    </w:p>
+    <w:p>
+      <w:pPr>
+        <w:rPr>
+          <w:i/>
+          <w:iCs/>
+        </w:rPr>
+      </w:pPr>
+      <w:r>
+        <w:rPr>
+          <w:b/>
+          <w:bCs/>
+          <w:color w:val="C00000"/>
+        </w:rPr>
+        <w:t xml:space="preserve"> We further clarify that the binding constraint on transferability is the structural adequacy of the underlying mechanistic model for the target system,</w:t>
+      </w:r>
+      <w:r>
+        <w:rPr>
+          <w:b/>
+          <w:bCs/>
+          <w:color w:val="C00000"/>
+        </w:rPr>
+        <w:t xml:space="preserve"> </w:t>
+      </w:r>
+      <w:r>
+        <w:rPr>
+          <w:b/>
+          <w:bCs/>
+          <w:color w:val="C00000"/>
+        </w:rPr>
+        <w:t>not biological distance per se. We discuss concrete scenarios in which applying the framework without first updating the model structure would yield</w:t>
+      </w:r>
+      <w:r>
+        <w:rPr>
+          <w:b/>
+          <w:bCs/>
+          <w:color w:val="C00000"/>
+        </w:rPr>
+        <w:t xml:space="preserve"> </w:t>
+      </w:r>
+      <w:r>
+        <w:rPr>
+          <w:b/>
+          <w:bCs/>
+          <w:color w:val="C00000"/>
+        </w:rPr>
+        <w:t xml:space="preserve">numerically plausible but biologically uninterpretable parameter </w:t>
+      </w:r>
+      <w:proofErr w:type="gramStart"/>
+      <w:r>
+        <w:rPr>
+          <w:b/>
+          <w:bCs/>
+          <w:color w:val="C00000"/>
+        </w:rPr>
+        <w:t>estimates,</w:t>
+      </w:r>
+      <w:r>
+        <w:rPr>
+          <w:b/>
+          <w:bCs/>
+          <w:color w:val="C00000"/>
+        </w:rPr>
+        <w:t xml:space="preserve">  </w:t>
+      </w:r>
+      <w:r>
+        <w:rPr>
+          <w:b/>
+          <w:bCs/>
+          <w:color w:val="C00000"/>
+        </w:rPr>
+        <w:t>and</w:t>
+      </w:r>
+      <w:proofErr w:type="gramEnd"/>
+      <w:r>
+        <w:rPr>
+          <w:b/>
+          <w:bCs/>
+          <w:color w:val="C00000"/>
+        </w:rPr>
+        <w:t xml:space="preserve"> note that in such cases the model </w:t>
+      </w:r>
+      <w:r>
+        <w:rPr>
+          <w:b/>
+          <w:bCs/>
+          <w:color w:val="C00000"/>
+        </w:rPr>
+        <w:t xml:space="preserve">structure </w:t>
+      </w:r>
+      <w:r>
+        <w:rPr>
+          <w:b/>
+          <w:bCs/>
+          <w:color w:val="C00000"/>
+        </w:rPr>
+        <w:t>should be updated before the framework is applied.</w:t>
+      </w:r>
+      <w:r>
+        <w:rPr>
+          <w:i/>
+          <w:iCs/>
+          <w:color w:val="C00000"/>
+        </w:rPr>
+        <w:t xml:space="preserve"> </w:t>
+      </w:r>
       <w:r>
         <w:rPr>
           <w:i/>
@@ -1306,6 +1490,7 @@
           <w:i/>
           <w:iCs/>
         </w:rPr>
+        <w:lastRenderedPageBreak/>
         <w:t>Ensure broad claims about hybrid modelling, transferability, and state estimation methods are supported by specific references.</w:t>
       </w:r>
     </w:p>

</xml_diff>